<commit_message>
docs: update project solution and README
- Remove all mentions of ЕвразТехника ИС from project document
- Add section 7.6: transparent proxy on NAS (fake-IP + dnsmasq + xray)
- Add section 7.7: homework file attachments (docs_for_lesson, doc, BufferedInputFile)
- Add section 7.8: file server (files.ivanwebdeveloper.ru)
- Add version 2.1 to version history
- Update VPS topology and integration table
- Rewrite README with current feature list and architecture
</commit_message>
<xml_diff>
--- a/docs/Проектное_решение_ruobr_unified_bot.docx
+++ b/docs/Проектное_решение_ruobr_unified_bot.docx
@@ -58,7 +58,7 @@
           <w:rFonts w:ascii="Times New Roman" w:hAnsi="Times New Roman"/>
           <w:sz w:val="28"/>
         </w:rPr>
-        <w:t>ООО «ЕвразТехника ИС»</w:t>
+        <w:t>Барданос В.В.</w:t>
       </w:r>
     </w:p>
     <w:p>
@@ -776,7 +776,7 @@
                 <w:rFonts w:ascii="Times New Roman" w:hAnsi="Times New Roman"/>
                 <w:sz w:val="22"/>
               </w:rPr>
-              <w:t>ЕвразТехника ИС</w:t>
+              <w:t>Барданос В.В.</w:t>
             </w:r>
           </w:p>
         </w:tc>
@@ -834,7 +834,7 @@
                 <w:rFonts w:ascii="Times New Roman" w:hAnsi="Times New Roman"/>
                 <w:sz w:val="22"/>
               </w:rPr>
-              <w:t>ЕвразТехника ИС</w:t>
+              <w:t>Барданос В.В.</w:t>
             </w:r>
           </w:p>
         </w:tc>
@@ -892,7 +892,7 @@
                 <w:rFonts w:ascii="Times New Roman" w:hAnsi="Times New Roman"/>
                 <w:sz w:val="22"/>
               </w:rPr>
-              <w:t>ЕвразТехника ИС</w:t>
+              <w:t>Барданос В.В.</w:t>
             </w:r>
           </w:p>
         </w:tc>
@@ -950,7 +950,7 @@
                 <w:rFonts w:ascii="Times New Roman" w:hAnsi="Times New Roman"/>
                 <w:sz w:val="22"/>
               </w:rPr>
-              <w:t>ЕвразТехника ИС</w:t>
+              <w:t>Барданос В.В.</w:t>
             </w:r>
           </w:p>
         </w:tc>
@@ -1308,7 +1308,7 @@
                 <w:rFonts w:ascii="Times New Roman" w:hAnsi="Times New Roman"/>
                 <w:sz w:val="22"/>
               </w:rPr>
-              <w:t>ООО «ЕвразТехника ИС»</w:t>
+              <w:t>Барданос В.В.</w:t>
             </w:r>
           </w:p>
         </w:tc>
@@ -5614,6 +5614,45 @@
           <w:sz w:val="28"/>
         </w:rPr>
         <w:t>База данных SQLite хранится в Docker-volume ./data-prod. Рекомендуется периодическое резервное копирование файла ruobr_bot.db (и WAL-файла ruobr_bot.db-wal) на внешний носитель или в облачное хранилище. При переносе БД между серверами необходимо выполнить PRAGMA wal_checkpoint(TRUNCATE) перед копированием для консолидации WAL в основной файл.</w:t>
+      </w:r>
+    </w:p>
+    <w:p>
+      <w:pPr>
+        <w:pStyle w:val="Heading1"/>
+      </w:pPr>
+      <w:r>
+        <w:t>7.6. Прозрачный прокси на NAS (fake-IP)</w:t>
+      </w:r>
+    </w:p>
+    <w:p>
+      <w:r>
+        <w:t>Для обеспечения доступа к заблокированным ресурсам (Instagram, ChatGPT и др.) из локальной сети без установки клиентского ПО на устройства, на NAS развёрнут прозрачный прокси. Механизм fake-IP: dnsmasq перехватывает DNS-запросы к целевым доменам и возвращает адреса из зарезервированной подсети 198.18.0.0/15, правила iptables (PREROUTING/REDIRECT) направляют трафик на эти адреса в xray (dokodemo-door на порту 12345), который маршрутизирует его через VLESS+Reality-туннель к VPS. На VPS развёрнут Xray-сервер с inbound VLESS+Reality на порту 8443, маскирующий трафик под HTTPS к реальному домену files.ivanwebdeveloper.ru. Список целевых доменов хранится в файле /opt/xray-proxy/domains.txt и может быть расширен через скрипт add-domain.sh. Роутер TP-Link AX5400 настроен со статическим маршрутом 198.18.0.0/15 через NAS (192.168.0.2).</w:t>
+      </w:r>
+    </w:p>
+    <w:p>
+      <w:pPr>
+        <w:pStyle w:val="Heading1"/>
+      </w:pPr>
+      <w:r>
+        <w:t>7.7. Скачивание вложений домашних заданий</w:t>
+      </w:r>
+    </w:p>
+    <w:p>
+      <w:r>
+        <w:t>Реализована поддержка скачивания и отправки файлов, прикреплённых к домашним заданиям. Бот извлекает файлы из HTML-поля text (regex для &lt;a href&gt; и &lt;img src&gt;) и из новых полей API: doc/doc_str (вложения на уровне задачи) и docs_for_lesson (вложения на уровне урока). Файлы скачиваются через авторизованную сессию Ruobr с поддержкой двух режимов: без авторизации (для публичных CDN) и с авторизацией через заголовки username/password. Отправка в Telegram осуществляется через BufferedInputFile (aiogram 3.x): изображения — как photo, документы — как document. Максимальный размер файла — 10 МБ. При невозможности отправки файла предоставляется ссылка на файл в виде текстового сообщения.</w:t>
+      </w:r>
+    </w:p>
+    <w:p>
+      <w:pPr>
+        <w:pStyle w:val="Heading1"/>
+      </w:pPr>
+      <w:r>
+        <w:t>7.8. Сервер файлов (files.ivanwebdeveloper.ru)</w:t>
+      </w:r>
+    </w:p>
+    <w:p>
+      <w:r>
+        <w:t>На VPS развёртан HTTPS-файл-сервер с веб-интерфейсом по адресу files.ivanwebdeveloper.ru. Сервер реализован на Python (http.server) и работает на localhost:8081. Caddy выступает в роли обратного прокси с автоматическим получением TLS-сертификата Let's Encrypt. Функциональность: загрузка файлов через drag-and-drop или выбор из файловой системы, получение прямых ссылок для скачивания, просмотр списка всех файлов с возможностью копирования ссылок и удаления файлов (через одноразовые токены).</w:t>
       </w:r>
     </w:p>
     <w:sectPr>

</xml_diff>